<commit_message>
docs: ajustar responsavel do relatorio
</commit_message>
<xml_diff>
--- a/docs/relatorio-a3.docx
+++ b/docs/relatorio-a3.docx
@@ -340,12 +340,12 @@
     </w:p>
     <w:p>
       <w:r>
-        <w:t xml:space="preserve">05/06/2026 - Criação do documento inicial com melhorias já realizadas. Responsável: JcMauro / Codex.</w:t>
-      </w:r>
-    </w:p>
-    <w:p>
-      <w:r>
-        <w:t xml:space="preserve">05/06/2026 - Correção da acentuação e revisão textual do documento. Responsável: JcMauro / Codex.</w:t>
+        <w:t xml:space="preserve">05/06/2026 - Criação do documento inicial com melhorias já realizadas. Responsável: Júlio Cesar de Souza Mauro.</w:t>
+      </w:r>
+    </w:p>
+    <w:p>
+      <w:r>
+        <w:t xml:space="preserve">05/06/2026 - Correção da acentuação e revisão textual do documento. Responsável: Júlio Cesar de Souza Mauro.</w:t>
       </w:r>
     </w:p>
     <w:sectPr>

</xml_diff>

<commit_message>
refactor: ajustar regras simples de estoque
</commit_message>
<xml_diff>
--- a/docs/relatorio-a3.docx
+++ b/docs/relatorio-a3.docx
@@ -352,6 +352,11 @@
       <w:pgSz w:w="11906" w:h="16838"/>
       <w:pgMar w:top="1440" w:right="1440" w:bottom="1440" w:left="1440"/>
     </w:sectPr>
+    <w:p>
+      <w:r>
+        <w:t xml:space="preserve">05/06/2026 - Registro dos ajustes de regras de estoque, valida??o de cadastro e textos da tela de remo??o. Respons?vel: J?lio Cesar de Souza Mauro.</w:t>
+      </w:r>
+    </w:p>
   </w:body>
 </w:document>
 </file>

</xml_diff>

<commit_message>
refactor: unificar movimentacao de estoque
</commit_message>
<xml_diff>
--- a/docs/relatorio-a3.docx
+++ b/docs/relatorio-a3.docx
@@ -355,6 +355,11 @@
     <w:p>
       <w:r>
         <w:t xml:space="preserve">05/06/2026 - Registro dos ajustes de regras de estoque, valida??o de cadastro e textos da tela de remo??o. Respons?vel: J?lio Cesar de Souza Mauro.</w:t>
+      </w:r>
+    </w:p>
+    <w:p>
+      <w:r>
+        <w:t xml:space="preserve">05/06/2026 - Unifica??o da tela de movimenta??o de estoque. Respons?vel: J?lio Cesar de Souza Mauro.</w:t>
       </w:r>
     </w:p>
   </w:body>

</xml_diff>

<commit_message>
fix: remover item duplicado do menu
</commit_message>
<xml_diff>
--- a/docs/relatorio-a3.docx
+++ b/docs/relatorio-a3.docx
@@ -360,6 +360,11 @@
     <w:p>
       <w:r>
         <w:t xml:space="preserve">05/06/2026 - Unifica??o da tela de movimenta??o de estoque. Respons?vel: J?lio Cesar de Souza Mauro.</w:t>
+      </w:r>
+    </w:p>
+    <w:p>
+      <w:r>
+        <w:t xml:space="preserve">05/06/2026 - Corre??o do item duplicado de movimenta??o de estoque no menu principal. Respons?vel: J?lio Cesar de Souza Mauro.</w:t>
       </w:r>
     </w:p>
   </w:body>

</xml_diff>

<commit_message>
test: configurar junit e testes dos modelos
</commit_message>
<xml_diff>
--- a/docs/relatorio-a3.docx
+++ b/docs/relatorio-a3.docx
@@ -365,6 +365,11 @@
     <w:p>
       <w:r>
         <w:t xml:space="preserve">05/06/2026 - Corre??o do item duplicado de movimenta??o de estoque no menu principal. Respons?vel: J?lio Cesar de Souza Mauro.</w:t>
+      </w:r>
+    </w:p>
+    <w:p>
+      <w:r>
+        <w:t xml:space="preserve">05/06/2026 - Configura??o do JUnit 5, JaCoCo e cria??o dos testes unit?rios dos modelos. Respons?vel: J?lio Cesar de Souza Mauro.</w:t>
       </w:r>
     </w:p>
   </w:body>

</xml_diff>

<commit_message>
feat: criar validadores de regras
</commit_message>
<xml_diff>
--- a/docs/relatorio-a3.docx
+++ b/docs/relatorio-a3.docx
@@ -370,6 +370,11 @@
     <w:p>
       <w:r>
         <w:t xml:space="preserve">05/06/2026 - Configura??o do JUnit 5, JaCoCo e cria??o dos testes unit?rios dos modelos. Respons?vel: J?lio Cesar de Souza Mauro.</w:t>
+      </w:r>
+    </w:p>
+    <w:p>
+      <w:r>
+        <w:t xml:space="preserve">05/06/2026 - Cria??o das classes simples de valida??o para usu?rios, categorias, produtos e estoque. Respons?vel: J?lio Cesar de Souza Mauro.</w:t>
       </w:r>
     </w:p>
   </w:body>

</xml_diff>

<commit_message>
Adiciona testes de validacao e atualiza relatorio a3
</commit_message>
<xml_diff>
--- a/docs/relatorio-a3.docx
+++ b/docs/relatorio-a3.docx
@@ -375,6 +375,11 @@
     <w:p>
       <w:r>
         <w:t xml:space="preserve">05/06/2026 - Cria??o das classes simples de valida??o para usu?rios, categorias, produtos e estoque. Respons?vel: J?lio Cesar de Souza Mauro.</w:t>
+      </w:r>
+    </w:p>
+    <w:p>
+      <w:r>
+        <w:t xml:space="preserve">05/06/2026 - Cria??o dos testes unit?rios dos validadores com cen?rios de sucesso e falha. Respons?vel: J?lio Cesar de Souza Mauro.</w:t>
       </w:r>
     </w:p>
   </w:body>

</xml_diff>

<commit_message>
test: adicionar testes de estoque e relatorios
</commit_message>
<xml_diff>
--- a/docs/relatorio-a3.docx
+++ b/docs/relatorio-a3.docx
@@ -269,7 +269,7 @@
     </w:p>
     <w:p>
       <w:r>
-        <w:t>- Resultado atual: 65 testes executados, com 0 falhas e 0 erros.</w:t>
+        <w:t>- Resultado atual: 70 testes executados, com 0 falhas e 0 erros.</w:t>
       </w:r>
     </w:p>
     <w:p>
@@ -447,6 +447,11 @@
     <w:p>
       <w:r>
         <w:t>05/06/2026 - Criação dos testes de integração dos DAOs com banco MySQL real e ajuste do cadastro de usuários para preencher username. Responsável: Júlio Cesar de Souza Mauro.</w:t>
+      </w:r>
+    </w:p>
+    <w:p>
+      <w:r>
+        <w:t>05/06/2026 - Criação dos testes de integração para movimentação de estoque e relatórios de produtos. Responsável: Júlio Cesar de Souza Mauro.</w:t>
       </w:r>
     </w:p>
     <w:sectPr>

</xml_diff>

<commit_message>
docs: registrar cobertura de testes
</commit_message>
<xml_diff>
--- a/docs/relatorio-a3.docx
+++ b/docs/relatorio-a3.docx
@@ -322,7 +322,7 @@
     </w:p>
     <w:p>
       <w:r>
-        <w:t>- Cobertura com JaCoCo.</w:t>
+        <w:t>- Cobertura com JaCoCo medida e registrada.</w:t>
       </w:r>
     </w:p>
     <w:p>
@@ -452,6 +452,11 @@
     <w:p>
       <w:r>
         <w:t>05/06/2026 - Criação dos testes de integração para movimentação de estoque e relatórios de produtos. Responsável: Júlio Cesar de Souza Mauro.</w:t>
+      </w:r>
+    </w:p>
+    <w:p>
+      <w:r>
+        <w:t>05/06/2026 - Medição da cobertura de testes com JaCoCo e registro dos percentuais no relatório. Responsável: Júlio Cesar de Souza Mauro.</w:t>
       </w:r>
     </w:p>
     <w:sectPr>

</xml_diff>

<commit_message>
test: ajustar cobertura para backend
</commit_message>
<xml_diff>
--- a/docs/relatorio-a3.docx
+++ b/docs/relatorio-a3.docx
@@ -457,6 +457,11 @@
     <w:p>
       <w:r>
         <w:t>05/06/2026 - Medição da cobertura de testes com JaCoCo e registro dos percentuais no relatório. Responsável: Júlio Cesar de Souza Mauro.</w:t>
+      </w:r>
+    </w:p>
+    <w:p>
+      <w:r>
+        <w:t>05/06/2026 - Ajuste da cobertura JaCoCo para medir o backend, excluindo telas Swing do pacote visao. Responsável: Júlio Cesar de Souza Mauro.</w:t>
       </w:r>
     </w:p>
     <w:sectPr>

</xml_diff>

<commit_message>
ci: executar testes no github actions
</commit_message>
<xml_diff>
--- a/docs/relatorio-a3.docx
+++ b/docs/relatorio-a3.docx
@@ -327,7 +327,7 @@
     </w:p>
     <w:p>
       <w:r>
-        <w:t>- Integração contínua com GitHub Actions.</w:t>
+        <w:t>- Integração contínua com GitHub Actions configurada para execução dos testes Maven.</w:t>
       </w:r>
     </w:p>
     <w:p>
@@ -388,15 +388,15 @@
     </w:p>
     <w:p>
       <w:r>
-        <w:t>- Avaliar a inclusão de integração contínua no GitHub Actions.</w:t>
-      </w:r>
-    </w:p>
-    <w:p>
-      <w:r>
         <w:t>- Avaliar a inclusão de análise estática com SonarCloud ou ferramenta equivalente.</w:t>
       </w:r>
     </w:p>
     <w:p>
+      <w:r>
+        <w:t>- Avaliar a inclusão de análise estática com SonarCloud ou ferramenta equivalente.</w:t>
+      </w:r>
+    </w:p>
+    <w:p>
       <w:pPr>
         <w:pStyle w:val="Heading1"/>
       </w:pPr>
@@ -462,6 +462,11 @@
     <w:p>
       <w:r>
         <w:t>05/06/2026 - Ajuste da cobertura JaCoCo para medir o backend, excluindo telas Swing do pacote visao. Responsável: Júlio Cesar de Souza Mauro.</w:t>
+      </w:r>
+    </w:p>
+    <w:p>
+      <w:r>
+        <w:t>05/06/2026 - Criação do workflow GitHub Actions para execução automática dos testes Maven com MySQL. Responsável: Júlio Cesar de Souza Mauro.</w:t>
       </w:r>
     </w:p>
     <w:sectPr>

</xml_diff>

<commit_message>
ci: adicionar analise sonarcloud
</commit_message>
<xml_diff>
--- a/docs/relatorio-a3.docx
+++ b/docs/relatorio-a3.docx
@@ -467,6 +467,11 @@
     <w:p>
       <w:r>
         <w:t>05/06/2026 - Criação do workflow GitHub Actions para execução automática dos testes Maven com MySQL. Responsável: Júlio Cesar de Souza Mauro.</w:t>
+      </w:r>
+    </w:p>
+    <w:p>
+      <w:r>
+        <w:t>05/06/2026 - Configuração da análise estática com SonarCloud no Maven e no GitHub Actions. Responsável: Júlio Cesar de Souza Mauro.</w:t>
       </w:r>
     </w:p>
     <w:sectPr>

</xml_diff>

<commit_message>
fix: corrigir issues do sonarcloud
</commit_message>
<xml_diff>
--- a/docs/relatorio-a3.docx
+++ b/docs/relatorio-a3.docx
@@ -472,6 +472,11 @@
     <w:p>
       <w:r>
         <w:t>05/06/2026 - Configuração da análise estática com SonarCloud no Maven e no GitHub Actions. Responsável: Júlio Cesar de Souza Mauro.</w:t>
+      </w:r>
+    </w:p>
+    <w:p>
+      <w:r>
+        <w:t>05/06/2026 - Correção de issues de confiabilidade apontadas pelo SonarCloud em ProdutoDAO e FrmProduto. Responsável: Júlio Cesar de Souza Mauro.</w:t>
       </w:r>
     </w:p>
     <w:sectPr>

</xml_diff>

<commit_message>
ci: focar sonarcloud no backend
</commit_message>
<xml_diff>
--- a/docs/relatorio-a3.docx
+++ b/docs/relatorio-a3.docx
@@ -477,6 +477,11 @@
     <w:p>
       <w:r>
         <w:t>05/06/2026 - Correção de issues de confiabilidade apontadas pelo SonarCloud em ProdutoDAO e FrmProduto. Responsável: Júlio Cesar de Souza Mauro.</w:t>
+      </w:r>
+    </w:p>
+    <w:p>
+      <w:r>
+        <w:t>05/06/2026 - Ajuste do SonarCloud para analisar somente o backend, excluindo telas Swing do pacote visao. Responsável: Júlio Cesar de Souza Mauro.</w:t>
       </w:r>
     </w:p>
     <w:sectPr>

</xml_diff>

<commit_message>
fix: remover stack traces de erros tratados
</commit_message>
<xml_diff>
--- a/docs/relatorio-a3.docx
+++ b/docs/relatorio-a3.docx
@@ -1,5 +1,5 @@
 
-<file path=word/document.xml><?xml version="1.0" encoding="utf-8"?>
+<file path=word\document.xml><?xml version="1.0" encoding="utf-8"?>
 <w:document xmlns:w="http://schemas.openxmlformats.org/wordprocessingml/2006/main">
   <w:body>
     <w:p>
@@ -488,11 +488,29 @@
       <w:pgSz w:w="11906" w:h="16838"/>
       <w:pgMar w:top="1440" w:right="1440" w:bottom="1440" w:left="1440"/>
     </w:sectPr>
+    <w:p>
+      <w:r>
+        <w:rPr>
+          <w:b/>
+        </w:rPr>
+        <w:t>Atualização de qualidade - Security Hotspots</w:t>
+      </w:r>
+    </w:p>
+    <w:p>
+      <w:r>
+        <w:t>Foram removidas chamadas de debug com printStackTrace das classes de acesso a dados e da tela de cadastro de usuários. A alteração reduz alertas de Security Hotspots do SonarCloud e evita a exposição de detalhes internos em mensagens de erro.</w:t>
+      </w:r>
+    </w:p>
+    <w:p>
+      <w:r>
+        <w:t>A melhoria manteve o comportamento original do sistema: os erros continuam sendo tratados com mensagens simples, sem alterar regras de negócio, banco de dados, telas ou fluxo de uso.</w:t>
+      </w:r>
+    </w:p>
   </w:body>
 </w:document>
 </file>
 
-<file path=word/styles.xml><?xml version="1.0" encoding="utf-8"?>
+<file path=word\styles.xml><?xml version="1.0" encoding="utf-8"?>
 <w:styles xmlns:w="http://schemas.openxmlformats.org/wordprocessingml/2006/main">
   <w:style w:type="paragraph" w:styleId="Title">
     <w:name w:val="Title"/>

</xml_diff>

<commit_message>
fix: revisar textos e fechamento de telas
</commit_message>
<xml_diff>
--- a/docs/relatorio-a3.docx
+++ b/docs/relatorio-a3.docx
@@ -504,6 +504,29 @@
     <w:p>
       <w:r>
         <w:t>A melhoria manteve o comportamento original do sistema: os erros continuam sendo tratados com mensagens simples, sem alterar regras de negócio, banco de dados, telas ou fluxo de uso.</w:t>
+      </w:r>
+    </w:p>
+    <w:p>
+      <w:r>
+        <w:rPr>
+          <w:b/>
+        </w:rPr>
+        <w:t>Revisão final do projeto</w:t>
+      </w:r>
+    </w:p>
+    <w:p>
+      <w:r>
+        <w:t>Foi realizada uma revisão geral antes da documentação final, verificando acentuação dos textos, chamadas entre telas, regras simples de validação, comunicação com os DAOs e compatibilidade das consultas com o script do banco de dados.</w:t>
+      </w:r>
+    </w:p>
+    <w:p>
+      <w:r>
+        <w:t>Foram aplicados ajustes pontuais: fechamento de telas internas sem encerrar o sistema, correção de acentos em mensagens e labels, validação da unidade no cadastro/edição de produtos e correção de texto no cadastro de usuários. As alterações mantêm o escopo simples e acadêmico do projeto.</w:t>
+      </w:r>
+    </w:p>
+    <w:p>
+      <w:r>
+        <w:t>A compilação direta das classes principais com Java 17 foi executada com sucesso. O cliente MySQL não estava disponível no PATH local, então a validação do banco foi feita por conferência do script SQL e pela configuração já validada no GitHub Actions.</w:t>
       </w:r>
     </w:p>
   </w:body>

</xml_diff>